<commit_message>
Actualizacion mié. 23/09/2026 16:42:00,33
</commit_message>
<xml_diff>
--- a/Claude outputs/liquidaciones_signo_debe_haber.docx
+++ b/Claude outputs/liquidaciones_signo_debe_haber.docx
@@ -13,7 +13,7 @@
     </w:p>
     <w:p>
       <w:pPr>
-        <w:spacing w:after="320"/>
+        <w:spacing w:after="80"/>
       </w:pPr>
       <w:r>
         <w:rPr>
@@ -26,6 +26,21 @@
     </w:p>
     <w:p>
       <w:pPr>
+        <w:spacing w:after="320"/>
+      </w:pPr>
+      <w:r>
+        <w:rPr>
+          <w:i/>
+          <w:iCs/>
+          <w:color w:val="888888"/>
+          <w:sz w:val="18"/>
+          <w:szCs w:val="18"/>
+        </w:rPr>
+        <w:t xml:space="preserve">Revisión: se corrigió la regla de signo el mismo día, después de probarla con datos reales (ver sección 2).</w:t>
+      </w:r>
+    </w:p>
+    <w:p>
+      <w:pPr>
         <w:pStyle w:val="Heading1"/>
         <w:spacing w:after="160" w:before="320"/>
       </w:pPr>
@@ -151,20 +166,7 @@
         <w:spacing w:after="160"/>
       </w:pPr>
       <w:r>
-        <w:t xml:space="preserve">Un movimiento de caja necesita invertirse (tratarse como positivo aunque esté guardado en negativo) cuando se cumplen las DOS condiciones a la vez:</w:t>
-      </w:r>
-    </w:p>
-    <w:p>
-      <w:pPr>
-        <w:pStyle w:val="ListParagraph"/>
-        <w:numPr>
-          <w:ilvl w:val="0"/>
-          <w:numId w:val="1"/>
-        </w:numPr>
-        <w:spacing w:after="80"/>
-      </w:pPr>
-      <w:r>
-        <w:t xml:space="preserve">Ya está cargado en un libro de banco real (Nación, Macro, etc.) — es decir, ya salió de "cartera".</w:t>
+        <w:t xml:space="preserve">Un movimiento de caja se trata como positivo (aunque esté guardado en negativo) cuando se cumplen estas dos condiciones a la vez:</w:t>
       </w:r>
     </w:p>
     <w:p>
@@ -178,6 +180,19 @@
       </w:pPr>
       <w:r>
         <w:t xml:space="preserve">El receptor del movimiento es la propia Fontana.</w:t>
+      </w:r>
+    </w:p>
+    <w:p>
+      <w:pPr>
+        <w:pStyle w:val="ListParagraph"/>
+        <w:numPr>
+          <w:ilvl w:val="0"/>
+          <w:numId w:val="1"/>
+        </w:numPr>
+        <w:spacing w:after="80"/>
+      </w:pPr>
+      <w:r>
+        <w:t xml:space="preserve">El monto está guardado en negativo.</w:t>
       </w:r>
     </w:p>
     <w:p>
@@ -200,7 +215,14 @@
         <w:spacing w:after="160"/>
       </w:pPr>
       <w:r>
-        <w:t xml:space="preserve">Un cheque todavía en cartera (sin libro asignado) tampoco se ve afectado, aunque su receptor ya sea Fontana: falta la primera condición (no tiene libro todavía), así que se sigue sumando tal cual, en positivo.</w:t>
+        <w:rPr>
+          <w:b/>
+          <w:bCs/>
+        </w:rPr>
+        <w:t xml:space="preserve">Ajuste del mismo día, con datos reales: </w:t>
+      </w:r>
+      <w:r>
+        <w:t xml:space="preserve">la primera versión de esta regla pedía además que el movimiento ya tuviera un asiento formal de libro de banco (hoja/renglón) cargado. Al probarla con una liquidación de cobro real (4 e-cheques recibidos de un cliente) se vio que esa condición de más no reflejaba la práctica: los e-cheques ya estaban guardados en negativo pero todavía no tenían ese asiento formal cargado, así que la corrección nunca se activaba y seguían restando. Se sacó esa condición: alcanza con receptor = Fontana y monto negativo, sin exigir nada del libro de banco. Esto es seguro porque, para una liquidación de cobro, el sistema ya sólo ofrece para elegir movimientos con receptor = Fontana — ahí nunca puede haber una salida real que deba quedar en negativo.</w:t>
       </w:r>
     </w:p>
     <w:p>
@@ -390,7 +412,7 @@
         <w:t xml:space="preserve">movimientos_caja/models.py</w:t>
       </w:r>
       <w:r>
-        <w:t xml:space="preserve">: nuevas propiedades en el modelo </w:t>
+        <w:t xml:space="preserve">: propiedades en el modelo </w:t>
       </w:r>
       <w:r>
         <w:rPr>
@@ -409,32 +431,32 @@
           <w:sz w:val="20"/>
           <w:szCs w:val="20"/>
         </w:rPr>
+        <w:t xml:space="preserve">necesita_invertir_signo_liquidacion</w:t>
+      </w:r>
+      <w:r>
+        <w:t xml:space="preserve"> (la regla) y </w:t>
+      </w:r>
+      <w:r>
+        <w:rPr>
+          <w:rFonts w:ascii="Consolas" w:cs="Consolas" w:eastAsia="Consolas" w:hAnsi="Consolas"/>
+          <w:sz w:val="20"/>
+          <w:szCs w:val="20"/>
+        </w:rPr>
+        <w:t xml:space="preserve">monto_para_liquidacion</w:t>
+      </w:r>
+      <w:r>
+        <w:t xml:space="preserve"> (el monto ya corregido). </w:t>
+      </w:r>
+      <w:r>
+        <w:rPr>
+          <w:rFonts w:ascii="Consolas" w:cs="Consolas" w:eastAsia="Consolas" w:hAnsi="Consolas"/>
+          <w:sz w:val="20"/>
+          <w:szCs w:val="20"/>
+        </w:rPr>
         <w:t xml:space="preserve">tiene_libro_banco</w:t>
       </w:r>
       <w:r>
-        <w:t xml:space="preserve">, </w:t>
-      </w:r>
-      <w:r>
-        <w:rPr>
-          <w:rFonts w:ascii="Consolas" w:cs="Consolas" w:eastAsia="Consolas" w:hAnsi="Consolas"/>
-          <w:sz w:val="20"/>
-          <w:szCs w:val="20"/>
-        </w:rPr>
-        <w:t xml:space="preserve">necesita_invertir_signo_liquidacion</w:t>
-      </w:r>
-      <w:r>
-        <w:t xml:space="preserve">, </w:t>
-      </w:r>
-      <w:r>
-        <w:rPr>
-          <w:rFonts w:ascii="Consolas" w:cs="Consolas" w:eastAsia="Consolas" w:hAnsi="Consolas"/>
-          <w:sz w:val="20"/>
-          <w:szCs w:val="20"/>
-        </w:rPr>
-        <w:t xml:space="preserve">monto_para_liquidacion</w:t>
-      </w:r>
-      <w:r>
-        <w:t xml:space="preserve">.</w:t>
+        <w:t xml:space="preserve"> sigue existiendo como propiedad aparte, pero ya no se usa para esta regla.</w:t>
       </w:r>
     </w:p>
     <w:p>
@@ -498,7 +520,29 @@
         <w:t xml:space="preserve">_monto_item()</w:t>
       </w:r>
       <w:r>
-        <w:t xml:space="preserve"> (monto que se muestra en pantalla al armar una liquidación).</w:t>
+        <w:t xml:space="preserve"> (monto que se muestra en pantalla al armar una liquidación) y </w:t>
+      </w:r>
+      <w:r>
+        <w:rPr>
+          <w:rFonts w:ascii="Consolas" w:cs="Consolas" w:eastAsia="Consolas" w:hAnsi="Consolas"/>
+          <w:sz w:val="20"/>
+          <w:szCs w:val="20"/>
+        </w:rPr>
+        <w:t xml:space="preserve">suma_movimientos()</w:t>
+      </w:r>
+      <w:r>
+        <w:t xml:space="preserve"> dentro de </w:t>
+      </w:r>
+      <w:r>
+        <w:rPr>
+          <w:rFonts w:ascii="Consolas" w:cs="Consolas" w:eastAsia="Consolas" w:hAnsi="Consolas"/>
+          <w:sz w:val="20"/>
+          <w:szCs w:val="20"/>
+        </w:rPr>
+        <w:t xml:space="preserve">liquidacion_diferencias()</w:t>
+      </w:r>
+      <w:r>
+        <w:t xml:space="preserve"> (pantalla "Diferencias", que compara el debe/haber guardado contra un recálculo — sin esta corrección iba a marcar como diferencia falsa cualquier liquidación de cobro con un movimiento corregido).</w:t>
       </w:r>
     </w:p>
     <w:p>
@@ -579,7 +623,7 @@
         <w:spacing w:after="160"/>
       </w:pPr>
       <w:r>
-        <w:t xml:space="preserve">Se agregó un script de prueba dedicado (20 verificaciones) que cubre: un cheque depositado con libro de banco se suma en positivo; un cheque en cartera (sin libro) no se toca; un pago saliente con libro pero receptor=proveedor no se toca; una liquidación de cobro completa con un cheque depositado balancea correctamente (Debe = Haber); y una liquidación de pago da exactamente el mismo total que antes del cambio. Se actualizaron además las pruebas existentes de la regla Debe/Haber para reflejar la nueva convención unificada.</w:t>
+        <w:t xml:space="preserve">Se agregó un script de prueba dedicado (23 verificaciones) que cubre: un cheque depositado con libro de banco se suma en positivo; un cheque en cartera (sin libro) no se toca; un pago saliente con libro pero receptor=proveedor no se toca; el caso real que falló (e-cheque en negativo, receptor=Fontana, todavía SIN libro de banco asignado) ahora sí se invierte; una liquidación de cobro completa balancea correctamente (Debe = Haber); una liquidación de pago da exactamente el mismo total que antes del cambio; y la pantalla "Diferencias" no marca ninguna de las dos liquidaciones de prueba como diferencia. Se actualizaron además las pruebas existentes de la regla Debe/Haber para reflejar la nueva convención unificada.</w:t>
       </w:r>
     </w:p>
     <w:p>

</xml_diff>